<commit_message>
Lay out the nomenclature the way the module template does
Co-Authored-By: Claude Opus 5.5 <noreply@anthropic.com>
Claude-Session: https://claude.ai/code/session_01S6mvbXzTvRoGpVPUkaDb65
</commit_message>
<xml_diff>
--- a/report/Nomenclature.docx
+++ b/report/Nomenclature.docx
@@ -3,20 +3,14 @@
 <w:document xmlns:wpc="http://schemas.microsoft.com/office/word/2010/wordprocessingCanvas" xmlns:mo="http://schemas.microsoft.com/office/mac/office/2008/main" xmlns:mc="http://schemas.openxmlformats.org/markup-compatibility/2006" xmlns:mv="urn:schemas-microsoft-com:mac:vml" xmlns:o="urn:schemas-microsoft-com:office:office" xmlns:r="http://schemas.openxmlformats.org/officeDocument/2006/relationships" xmlns:m="http://schemas.openxmlformats.org/officeDocument/2006/math" xmlns:v="urn:schemas-microsoft-com:vml" xmlns:wp14="http://schemas.microsoft.com/office/word/2010/wordprocessingDrawing" xmlns:wp="http://schemas.openxmlformats.org/drawingml/2006/wordprocessingDrawing" xmlns:w10="urn:schemas-microsoft-com:office:word" xmlns:w="http://schemas.openxmlformats.org/wordprocessingml/2006/main" xmlns:w14="http://schemas.microsoft.com/office/word/2010/wordml" xmlns:wpg="http://schemas.microsoft.com/office/word/2010/wordprocessingGroup" xmlns:wpi="http://schemas.microsoft.com/office/word/2010/wordprocessingInk" xmlns:wne="http://schemas.microsoft.com/office/word/2006/wordml" xmlns:wps="http://schemas.microsoft.com/office/word/2010/wordprocessingShape" mc:Ignorable="w14 wp14">
   <w:body>
     <w:p>
+      <w:pPr>
+        <w:spacing w:after="0"/>
+      </w:pPr>
       <w:r>
         <w:rPr>
-          <w:b/>
-          <w:sz w:val="28"/>
+          <w:sz w:val="32"/>
         </w:rPr>
         <w:t>Nomenclature</w:t>
-      </w:r>
-    </w:p>
-    <w:p>
-      <w:r>
-        <w:rPr>
-          <w:b/>
-        </w:rPr>
-        <w:t>Acronyms</w:t>
       </w:r>
     </w:p>
     <w:tbl>
@@ -25,42 +19,71 @@
         <w:tblLayout w:type="fixed"/>
         <w:tblLook w:firstColumn="1" w:firstRow="1" w:lastColumn="0" w:lastRow="0" w:noHBand="0" w:noVBand="1" w:val="04A0"/>
         <w:tblBorders>
-          <w:top w:val="nil"/>
-          <w:left w:val="nil"/>
-          <w:bottom w:val="nil"/>
-          <w:right w:val="nil"/>
-          <w:insideH w:val="nil"/>
-          <w:insideV w:val="nil"/>
+          <w:top w:val="none" w:sz="0" w:space="0" w:color="auto"/>
+          <w:left w:val="none" w:sz="0" w:space="0" w:color="auto"/>
+          <w:bottom w:val="none" w:sz="0" w:space="0" w:color="auto"/>
+          <w:right w:val="none" w:sz="0" w:space="0" w:color="auto"/>
+          <w:insideH w:val="none" w:sz="0" w:space="0" w:color="auto"/>
+          <w:insideV w:val="none" w:sz="0" w:space="0" w:color="auto"/>
         </w:tblBorders>
       </w:tblPr>
       <w:tblGrid>
-        <w:gridCol w:w="1701"/>
-        <w:gridCol w:w="7370"/>
+        <w:gridCol w:w="1838"/>
+        <w:gridCol w:w="7178"/>
       </w:tblGrid>
       <w:tr>
         <w:tc>
           <w:tcPr>
-            <w:tcW w:type="dxa" w:w="1701"/>
+            <w:tcW w:type="dxa" w:w="1838"/>
           </w:tcPr>
           <w:p>
             <w:pPr>
-              <w:spacing w:after="40"/>
+              <w:spacing w:after="0" w:line="276" w:lineRule="auto"/>
+              <w:jc w:val="left"/>
             </w:pPr>
             <w:r>
               <w:rPr>
-                <w:i w:val="0"/>
+                <w:u w:val="single"/>
               </w:rPr>
+              <w:t>Acronyms</w:t>
+            </w:r>
+          </w:p>
+        </w:tc>
+        <w:tc>
+          <w:tcPr>
+            <w:tcW w:type="dxa" w:w="7178"/>
+          </w:tcPr>
+          <w:p>
+            <w:pPr>
+              <w:spacing w:after="0" w:line="276" w:lineRule="auto"/>
+              <w:jc w:val="left"/>
+            </w:pPr>
+          </w:p>
+        </w:tc>
+      </w:tr>
+      <w:tr>
+        <w:tc>
+          <w:tcPr>
+            <w:tcW w:type="dxa" w:w="1838"/>
+          </w:tcPr>
+          <w:p>
+            <w:pPr>
+              <w:spacing w:after="0" w:line="276" w:lineRule="auto"/>
+              <w:jc w:val="left"/>
+            </w:pPr>
+            <w:r>
               <w:t>CAD</w:t>
             </w:r>
           </w:p>
         </w:tc>
         <w:tc>
           <w:tcPr>
-            <w:tcW w:type="dxa" w:w="7370"/>
+            <w:tcW w:type="dxa" w:w="7178"/>
           </w:tcPr>
           <w:p>
             <w:pPr>
-              <w:spacing w:after="40"/>
+              <w:spacing w:after="0" w:line="276" w:lineRule="auto"/>
+              <w:jc w:val="left"/>
             </w:pPr>
             <w:r>
               <w:t>Computer-Aided Design</w:t>
@@ -71,27 +94,26 @@
       <w:tr>
         <w:tc>
           <w:tcPr>
-            <w:tcW w:type="dxa" w:w="1701"/>
+            <w:tcW w:type="dxa" w:w="1838"/>
           </w:tcPr>
           <w:p>
             <w:pPr>
-              <w:spacing w:after="40"/>
+              <w:spacing w:after="0" w:line="276" w:lineRule="auto"/>
+              <w:jc w:val="left"/>
             </w:pPr>
             <w:r>
-              <w:rPr>
-                <w:i w:val="0"/>
-              </w:rPr>
               <w:t>CMMS</w:t>
             </w:r>
           </w:p>
         </w:tc>
         <w:tc>
           <w:tcPr>
-            <w:tcW w:type="dxa" w:w="7370"/>
+            <w:tcW w:type="dxa" w:w="7178"/>
           </w:tcPr>
           <w:p>
             <w:pPr>
-              <w:spacing w:after="40"/>
+              <w:spacing w:after="0" w:line="276" w:lineRule="auto"/>
+              <w:jc w:val="left"/>
             </w:pPr>
             <w:r>
               <w:t>Computerised Maintenance Management System</w:t>
@@ -102,27 +124,26 @@
       <w:tr>
         <w:tc>
           <w:tcPr>
-            <w:tcW w:type="dxa" w:w="1701"/>
+            <w:tcW w:type="dxa" w:w="1838"/>
           </w:tcPr>
           <w:p>
             <w:pPr>
-              <w:spacing w:after="40"/>
+              <w:spacing w:after="0" w:line="276" w:lineRule="auto"/>
+              <w:jc w:val="left"/>
             </w:pPr>
             <w:r>
-              <w:rPr>
-                <w:i w:val="0"/>
-              </w:rPr>
               <w:t>DN</w:t>
             </w:r>
           </w:p>
         </w:tc>
         <w:tc>
           <w:tcPr>
-            <w:tcW w:type="dxa" w:w="7370"/>
+            <w:tcW w:type="dxa" w:w="7178"/>
           </w:tcPr>
           <w:p>
             <w:pPr>
-              <w:spacing w:after="40"/>
+              <w:spacing w:after="0" w:line="276" w:lineRule="auto"/>
+              <w:jc w:val="left"/>
             </w:pPr>
             <w:r>
               <w:t>Distribution Network</w:t>
@@ -133,27 +154,26 @@
       <w:tr>
         <w:tc>
           <w:tcPr>
-            <w:tcW w:type="dxa" w:w="1701"/>
+            <w:tcW w:type="dxa" w:w="1838"/>
           </w:tcPr>
           <w:p>
             <w:pPr>
-              <w:spacing w:after="40"/>
+              <w:spacing w:after="0" w:line="276" w:lineRule="auto"/>
+              <w:jc w:val="left"/>
             </w:pPr>
             <w:r>
-              <w:rPr>
-                <w:i w:val="0"/>
-              </w:rPr>
               <w:t>EMA</w:t>
             </w:r>
           </w:p>
         </w:tc>
         <w:tc>
           <w:tcPr>
-            <w:tcW w:type="dxa" w:w="7370"/>
+            <w:tcW w:type="dxa" w:w="7178"/>
           </w:tcPr>
           <w:p>
             <w:pPr>
-              <w:spacing w:after="40"/>
+              <w:spacing w:after="0" w:line="276" w:lineRule="auto"/>
+              <w:jc w:val="left"/>
             </w:pPr>
             <w:r>
               <w:t>Energy Market Authority</w:t>
@@ -164,27 +184,26 @@
       <w:tr>
         <w:tc>
           <w:tcPr>
-            <w:tcW w:type="dxa" w:w="1701"/>
+            <w:tcW w:type="dxa" w:w="1838"/>
           </w:tcPr>
           <w:p>
             <w:pPr>
-              <w:spacing w:after="40"/>
+              <w:spacing w:after="0" w:line="276" w:lineRule="auto"/>
+              <w:jc w:val="left"/>
             </w:pPr>
             <w:r>
-              <w:rPr>
-                <w:i w:val="0"/>
-              </w:rPr>
               <w:t>HV</w:t>
             </w:r>
           </w:p>
         </w:tc>
         <w:tc>
           <w:tcPr>
-            <w:tcW w:type="dxa" w:w="7370"/>
+            <w:tcW w:type="dxa" w:w="7178"/>
           </w:tcPr>
           <w:p>
             <w:pPr>
-              <w:spacing w:after="40"/>
+              <w:spacing w:after="0" w:line="276" w:lineRule="auto"/>
+              <w:jc w:val="left"/>
             </w:pPr>
             <w:r>
               <w:t>High Voltage</w:t>
@@ -195,27 +214,26 @@
       <w:tr>
         <w:tc>
           <w:tcPr>
-            <w:tcW w:type="dxa" w:w="1701"/>
+            <w:tcW w:type="dxa" w:w="1838"/>
           </w:tcPr>
           <w:p>
             <w:pPr>
-              <w:spacing w:after="40"/>
+              <w:spacing w:after="0" w:line="276" w:lineRule="auto"/>
+              <w:jc w:val="left"/>
             </w:pPr>
             <w:r>
-              <w:rPr>
-                <w:i w:val="0"/>
-              </w:rPr>
               <w:t>HVAC</w:t>
             </w:r>
           </w:p>
         </w:tc>
         <w:tc>
           <w:tcPr>
-            <w:tcW w:type="dxa" w:w="7370"/>
+            <w:tcW w:type="dxa" w:w="7178"/>
           </w:tcPr>
           <w:p>
             <w:pPr>
-              <w:spacing w:after="40"/>
+              <w:spacing w:after="0" w:line="276" w:lineRule="auto"/>
+              <w:jc w:val="left"/>
             </w:pPr>
             <w:r>
               <w:t>Heating, Ventilation and Air Conditioning</w:t>
@@ -226,27 +244,26 @@
       <w:tr>
         <w:tc>
           <w:tcPr>
-            <w:tcW w:type="dxa" w:w="1701"/>
+            <w:tcW w:type="dxa" w:w="1838"/>
           </w:tcPr>
           <w:p>
             <w:pPr>
-              <w:spacing w:after="40"/>
+              <w:spacing w:after="0" w:line="276" w:lineRule="auto"/>
+              <w:jc w:val="left"/>
             </w:pPr>
             <w:r>
-              <w:rPr>
-                <w:i w:val="0"/>
-              </w:rPr>
               <w:t>LEW</w:t>
             </w:r>
           </w:p>
         </w:tc>
         <w:tc>
           <w:tcPr>
-            <w:tcW w:type="dxa" w:w="7370"/>
+            <w:tcW w:type="dxa" w:w="7178"/>
           </w:tcPr>
           <w:p>
             <w:pPr>
-              <w:spacing w:after="40"/>
+              <w:spacing w:after="0" w:line="276" w:lineRule="auto"/>
+              <w:jc w:val="left"/>
             </w:pPr>
             <w:r>
               <w:t>Licensed Electrical Worker</w:t>
@@ -257,27 +274,26 @@
       <w:tr>
         <w:tc>
           <w:tcPr>
-            <w:tcW w:type="dxa" w:w="1701"/>
+            <w:tcW w:type="dxa" w:w="1838"/>
           </w:tcPr>
           <w:p>
             <w:pPr>
-              <w:spacing w:after="40"/>
+              <w:spacing w:after="0" w:line="276" w:lineRule="auto"/>
+              <w:jc w:val="left"/>
             </w:pPr>
             <w:r>
-              <w:rPr>
-                <w:i w:val="0"/>
-              </w:rPr>
               <w:t>LV</w:t>
             </w:r>
           </w:p>
         </w:tc>
         <w:tc>
           <w:tcPr>
-            <w:tcW w:type="dxa" w:w="7370"/>
+            <w:tcW w:type="dxa" w:w="7178"/>
           </w:tcPr>
           <w:p>
             <w:pPr>
-              <w:spacing w:after="40"/>
+              <w:spacing w:after="0" w:line="276" w:lineRule="auto"/>
+              <w:jc w:val="left"/>
             </w:pPr>
             <w:r>
               <w:t>Low Voltage</w:t>
@@ -288,27 +304,26 @@
       <w:tr>
         <w:tc>
           <w:tcPr>
-            <w:tcW w:type="dxa" w:w="1701"/>
+            <w:tcW w:type="dxa" w:w="1838"/>
           </w:tcPr>
           <w:p>
             <w:pPr>
-              <w:spacing w:after="40"/>
+              <w:spacing w:after="0" w:line="276" w:lineRule="auto"/>
+              <w:jc w:val="left"/>
             </w:pPr>
             <w:r>
-              <w:rPr>
-                <w:i w:val="0"/>
-              </w:rPr>
               <w:t>LVDN</w:t>
             </w:r>
           </w:p>
         </w:tc>
         <w:tc>
           <w:tcPr>
-            <w:tcW w:type="dxa" w:w="7370"/>
+            <w:tcW w:type="dxa" w:w="7178"/>
           </w:tcPr>
           <w:p>
             <w:pPr>
-              <w:spacing w:after="40"/>
+              <w:spacing w:after="0" w:line="276" w:lineRule="auto"/>
+              <w:jc w:val="left"/>
             </w:pPr>
             <w:r>
               <w:t>Low-Voltage Distribution Network</w:t>
@@ -319,27 +334,26 @@
       <w:tr>
         <w:tc>
           <w:tcPr>
-            <w:tcW w:type="dxa" w:w="1701"/>
+            <w:tcW w:type="dxa" w:w="1838"/>
           </w:tcPr>
           <w:p>
             <w:pPr>
-              <w:spacing w:after="40"/>
+              <w:spacing w:after="0" w:line="276" w:lineRule="auto"/>
+              <w:jc w:val="left"/>
             </w:pPr>
             <w:r>
-              <w:rPr>
-                <w:i w:val="0"/>
-              </w:rPr>
               <w:t>LVSB</w:t>
             </w:r>
           </w:p>
         </w:tc>
         <w:tc>
           <w:tcPr>
-            <w:tcW w:type="dxa" w:w="7370"/>
+            <w:tcW w:type="dxa" w:w="7178"/>
           </w:tcPr>
           <w:p>
             <w:pPr>
-              <w:spacing w:after="40"/>
+              <w:spacing w:after="0" w:line="276" w:lineRule="auto"/>
+              <w:jc w:val="left"/>
             </w:pPr>
             <w:r>
               <w:t>Low-Voltage Switchboard</w:t>
@@ -350,27 +364,26 @@
       <w:tr>
         <w:tc>
           <w:tcPr>
-            <w:tcW w:type="dxa" w:w="1701"/>
+            <w:tcW w:type="dxa" w:w="1838"/>
           </w:tcPr>
           <w:p>
             <w:pPr>
-              <w:spacing w:after="40"/>
+              <w:spacing w:after="0" w:line="276" w:lineRule="auto"/>
+              <w:jc w:val="left"/>
             </w:pPr>
             <w:r>
-              <w:rPr>
-                <w:i w:val="0"/>
-              </w:rPr>
               <w:t>MCB</w:t>
             </w:r>
           </w:p>
         </w:tc>
         <w:tc>
           <w:tcPr>
-            <w:tcW w:type="dxa" w:w="7370"/>
+            <w:tcW w:type="dxa" w:w="7178"/>
           </w:tcPr>
           <w:p>
             <w:pPr>
-              <w:spacing w:after="40"/>
+              <w:spacing w:after="0" w:line="276" w:lineRule="auto"/>
+              <w:jc w:val="left"/>
             </w:pPr>
             <w:r>
               <w:t>Miniature Circuit Breaker</w:t>
@@ -381,27 +394,26 @@
       <w:tr>
         <w:tc>
           <w:tcPr>
-            <w:tcW w:type="dxa" w:w="1701"/>
+            <w:tcW w:type="dxa" w:w="1838"/>
           </w:tcPr>
           <w:p>
             <w:pPr>
-              <w:spacing w:after="40"/>
+              <w:spacing w:after="0" w:line="276" w:lineRule="auto"/>
+              <w:jc w:val="left"/>
             </w:pPr>
             <w:r>
-              <w:rPr>
-                <w:i w:val="0"/>
-              </w:rPr>
               <w:t>MCCB</w:t>
             </w:r>
           </w:p>
         </w:tc>
         <w:tc>
           <w:tcPr>
-            <w:tcW w:type="dxa" w:w="7370"/>
+            <w:tcW w:type="dxa" w:w="7178"/>
           </w:tcPr>
           <w:p>
             <w:pPr>
-              <w:spacing w:after="40"/>
+              <w:spacing w:after="0" w:line="276" w:lineRule="auto"/>
+              <w:jc w:val="left"/>
             </w:pPr>
             <w:r>
               <w:t>Moulded-Case Circuit Breaker</w:t>
@@ -412,27 +424,26 @@
       <w:tr>
         <w:tc>
           <w:tcPr>
-            <w:tcW w:type="dxa" w:w="1701"/>
+            <w:tcW w:type="dxa" w:w="1838"/>
           </w:tcPr>
           <w:p>
             <w:pPr>
-              <w:spacing w:after="40"/>
+              <w:spacing w:after="0" w:line="276" w:lineRule="auto"/>
+              <w:jc w:val="left"/>
             </w:pPr>
             <w:r>
-              <w:rPr>
-                <w:i w:val="0"/>
-              </w:rPr>
               <w:t>PDF</w:t>
             </w:r>
           </w:p>
         </w:tc>
         <w:tc>
           <w:tcPr>
-            <w:tcW w:type="dxa" w:w="7370"/>
+            <w:tcW w:type="dxa" w:w="7178"/>
           </w:tcPr>
           <w:p>
             <w:pPr>
-              <w:spacing w:after="40"/>
+              <w:spacing w:after="0" w:line="276" w:lineRule="auto"/>
+              <w:jc w:val="left"/>
             </w:pPr>
             <w:r>
               <w:t>Portable Document Format</w:t>
@@ -443,27 +454,26 @@
       <w:tr>
         <w:tc>
           <w:tcPr>
-            <w:tcW w:type="dxa" w:w="1701"/>
+            <w:tcW w:type="dxa" w:w="1838"/>
           </w:tcPr>
           <w:p>
             <w:pPr>
-              <w:spacing w:after="40"/>
+              <w:spacing w:after="0" w:line="276" w:lineRule="auto"/>
+              <w:jc w:val="left"/>
             </w:pPr>
             <w:r>
-              <w:rPr>
-                <w:i w:val="0"/>
-              </w:rPr>
               <w:t>RFID</w:t>
             </w:r>
           </w:p>
         </w:tc>
         <w:tc>
           <w:tcPr>
-            <w:tcW w:type="dxa" w:w="7370"/>
+            <w:tcW w:type="dxa" w:w="7178"/>
           </w:tcPr>
           <w:p>
             <w:pPr>
-              <w:spacing w:after="40"/>
+              <w:spacing w:after="0" w:line="276" w:lineRule="auto"/>
+              <w:jc w:val="left"/>
             </w:pPr>
             <w:r>
               <w:t>Radio-Frequency Identification</w:t>
@@ -474,27 +484,26 @@
       <w:tr>
         <w:tc>
           <w:tcPr>
-            <w:tcW w:type="dxa" w:w="1701"/>
+            <w:tcW w:type="dxa" w:w="1838"/>
           </w:tcPr>
           <w:p>
             <w:pPr>
-              <w:spacing w:after="40"/>
+              <w:spacing w:after="0" w:line="276" w:lineRule="auto"/>
+              <w:jc w:val="left"/>
             </w:pPr>
             <w:r>
-              <w:rPr>
-                <w:i w:val="0"/>
-              </w:rPr>
               <w:t>SCADA</w:t>
             </w:r>
           </w:p>
         </w:tc>
         <w:tc>
           <w:tcPr>
-            <w:tcW w:type="dxa" w:w="7370"/>
+            <w:tcW w:type="dxa" w:w="7178"/>
           </w:tcPr>
           <w:p>
             <w:pPr>
-              <w:spacing w:after="40"/>
+              <w:spacing w:after="0" w:line="276" w:lineRule="auto"/>
+              <w:jc w:val="left"/>
             </w:pPr>
             <w:r>
               <w:t>Supervisory Control and Data Acquisition</w:t>
@@ -505,27 +514,26 @@
       <w:tr>
         <w:tc>
           <w:tcPr>
-            <w:tcW w:type="dxa" w:w="1701"/>
+            <w:tcW w:type="dxa" w:w="1838"/>
           </w:tcPr>
           <w:p>
             <w:pPr>
-              <w:spacing w:after="40"/>
+              <w:spacing w:after="0" w:line="276" w:lineRule="auto"/>
+              <w:jc w:val="left"/>
             </w:pPr>
             <w:r>
-              <w:rPr>
-                <w:i w:val="0"/>
-              </w:rPr>
               <w:t>SDG</w:t>
             </w:r>
           </w:p>
         </w:tc>
         <w:tc>
           <w:tcPr>
-            <w:tcW w:type="dxa" w:w="7370"/>
+            <w:tcW w:type="dxa" w:w="7178"/>
           </w:tcPr>
           <w:p>
             <w:pPr>
-              <w:spacing w:after="40"/>
+              <w:spacing w:after="0" w:line="276" w:lineRule="auto"/>
+              <w:jc w:val="left"/>
             </w:pPr>
             <w:r>
               <w:t>Sustainable Development Goal</w:t>
@@ -536,27 +544,26 @@
       <w:tr>
         <w:tc>
           <w:tcPr>
-            <w:tcW w:type="dxa" w:w="1701"/>
+            <w:tcW w:type="dxa" w:w="1838"/>
           </w:tcPr>
           <w:p>
             <w:pPr>
-              <w:spacing w:after="40"/>
+              <w:spacing w:after="0" w:line="276" w:lineRule="auto"/>
+              <w:jc w:val="left"/>
             </w:pPr>
             <w:r>
-              <w:rPr>
-                <w:i w:val="0"/>
-              </w:rPr>
               <w:t>SLD</w:t>
             </w:r>
           </w:p>
         </w:tc>
         <w:tc>
           <w:tcPr>
-            <w:tcW w:type="dxa" w:w="7370"/>
+            <w:tcW w:type="dxa" w:w="7178"/>
           </w:tcPr>
           <w:p>
             <w:pPr>
-              <w:spacing w:after="40"/>
+              <w:spacing w:after="0" w:line="276" w:lineRule="auto"/>
+              <w:jc w:val="left"/>
             </w:pPr>
             <w:r>
               <w:t>Single-Line Diagram</w:t>
@@ -567,27 +574,26 @@
       <w:tr>
         <w:tc>
           <w:tcPr>
-            <w:tcW w:type="dxa" w:w="1701"/>
+            <w:tcW w:type="dxa" w:w="1838"/>
           </w:tcPr>
           <w:p>
             <w:pPr>
-              <w:spacing w:after="40"/>
+              <w:spacing w:after="0" w:line="276" w:lineRule="auto"/>
+              <w:jc w:val="left"/>
             </w:pPr>
             <w:r>
-              <w:rPr>
-                <w:i w:val="0"/>
-              </w:rPr>
               <w:t>SQL</w:t>
             </w:r>
           </w:p>
         </w:tc>
         <w:tc>
           <w:tcPr>
-            <w:tcW w:type="dxa" w:w="7370"/>
+            <w:tcW w:type="dxa" w:w="7178"/>
           </w:tcPr>
           <w:p>
             <w:pPr>
-              <w:spacing w:after="40"/>
+              <w:spacing w:after="0" w:line="276" w:lineRule="auto"/>
+              <w:jc w:val="left"/>
             </w:pPr>
             <w:r>
               <w:t>Structured Query Language</w:t>
@@ -598,27 +604,26 @@
       <w:tr>
         <w:tc>
           <w:tcPr>
-            <w:tcW w:type="dxa" w:w="1701"/>
+            <w:tcW w:type="dxa" w:w="1838"/>
           </w:tcPr>
           <w:p>
             <w:pPr>
-              <w:spacing w:after="40"/>
+              <w:spacing w:after="0" w:line="276" w:lineRule="auto"/>
+              <w:jc w:val="left"/>
             </w:pPr>
             <w:r>
-              <w:rPr>
-                <w:i w:val="0"/>
-              </w:rPr>
               <w:t>SS</w:t>
             </w:r>
           </w:p>
         </w:tc>
         <w:tc>
           <w:tcPr>
-            <w:tcW w:type="dxa" w:w="7370"/>
+            <w:tcW w:type="dxa" w:w="7178"/>
           </w:tcPr>
           <w:p>
             <w:pPr>
-              <w:spacing w:after="40"/>
+              <w:spacing w:after="0" w:line="276" w:lineRule="auto"/>
+              <w:jc w:val="left"/>
             </w:pPr>
             <w:r>
               <w:t>Singapore Standard</w:t>
@@ -629,27 +634,26 @@
       <w:tr>
         <w:tc>
           <w:tcPr>
-            <w:tcW w:type="dxa" w:w="1701"/>
+            <w:tcW w:type="dxa" w:w="1838"/>
           </w:tcPr>
           <w:p>
             <w:pPr>
-              <w:spacing w:after="40"/>
+              <w:spacing w:after="0" w:line="276" w:lineRule="auto"/>
+              <w:jc w:val="left"/>
             </w:pPr>
             <w:r>
-              <w:rPr>
-                <w:i w:val="0"/>
-              </w:rPr>
               <w:t>SSMC</w:t>
             </w:r>
           </w:p>
         </w:tc>
         <w:tc>
           <w:tcPr>
-            <w:tcW w:type="dxa" w:w="7370"/>
+            <w:tcW w:type="dxa" w:w="7178"/>
           </w:tcPr>
           <w:p>
             <w:pPr>
-              <w:spacing w:after="40"/>
+              <w:spacing w:after="0" w:line="276" w:lineRule="auto"/>
+              <w:jc w:val="left"/>
             </w:pPr>
             <w:r>
               <w:t>Systems on Silicon Manufacturing Company</w:t>
@@ -660,27 +664,26 @@
       <w:tr>
         <w:tc>
           <w:tcPr>
-            <w:tcW w:type="dxa" w:w="1701"/>
+            <w:tcW w:type="dxa" w:w="1838"/>
           </w:tcPr>
           <w:p>
             <w:pPr>
-              <w:spacing w:after="40"/>
+              <w:spacing w:after="0" w:line="276" w:lineRule="auto"/>
+              <w:jc w:val="left"/>
             </w:pPr>
             <w:r>
-              <w:rPr>
-                <w:i w:val="0"/>
-              </w:rPr>
               <w:t>URL</w:t>
             </w:r>
           </w:p>
         </w:tc>
         <w:tc>
           <w:tcPr>
-            <w:tcW w:type="dxa" w:w="7370"/>
+            <w:tcW w:type="dxa" w:w="7178"/>
           </w:tcPr>
           <w:p>
             <w:pPr>
-              <w:spacing w:after="40"/>
+              <w:spacing w:after="0" w:line="276" w:lineRule="auto"/>
+              <w:jc w:val="left"/>
             </w:pPr>
             <w:r>
               <w:t>Uniform Resource Locator</w:t>
@@ -691,27 +694,26 @@
       <w:tr>
         <w:tc>
           <w:tcPr>
-            <w:tcW w:type="dxa" w:w="1701"/>
+            <w:tcW w:type="dxa" w:w="1838"/>
           </w:tcPr>
           <w:p>
             <w:pPr>
-              <w:spacing w:after="40"/>
+              <w:spacing w:after="0" w:line="276" w:lineRule="auto"/>
+              <w:jc w:val="left"/>
             </w:pPr>
             <w:r>
-              <w:rPr>
-                <w:i w:val="0"/>
-              </w:rPr>
               <w:t>µPMU</w:t>
             </w:r>
           </w:p>
         </w:tc>
         <w:tc>
           <w:tcPr>
-            <w:tcW w:type="dxa" w:w="7370"/>
+            <w:tcW w:type="dxa" w:w="7178"/>
           </w:tcPr>
           <w:p>
             <w:pPr>
-              <w:spacing w:after="40"/>
+              <w:spacing w:after="0" w:line="276" w:lineRule="auto"/>
+              <w:jc w:val="left"/>
             </w:pPr>
             <w:r>
               <w:t>Micro-Phasor Measurement Unit</w:t>
@@ -719,60 +721,85 @@
           </w:p>
         </w:tc>
       </w:tr>
-    </w:tbl>
-    <w:p>
-      <w:pPr>
-        <w:spacing w:before="240"/>
-      </w:pPr>
-      <w:r>
-        <w:rPr>
-          <w:b/>
-        </w:rPr>
-        <w:t>Symbols</w:t>
-      </w:r>
-    </w:p>
-    <w:tbl>
-      <w:tblPr>
-        <w:tblW w:type="auto" w:w="0"/>
-        <w:tblLayout w:type="fixed"/>
-        <w:tblLook w:firstColumn="1" w:firstRow="1" w:lastColumn="0" w:lastRow="0" w:noHBand="0" w:noVBand="1" w:val="04A0"/>
-        <w:tblBorders>
-          <w:top w:val="nil"/>
-          <w:left w:val="nil"/>
-          <w:bottom w:val="nil"/>
-          <w:right w:val="nil"/>
-          <w:insideH w:val="nil"/>
-          <w:insideV w:val="nil"/>
-        </w:tblBorders>
-      </w:tblPr>
-      <w:tblGrid>
-        <w:gridCol w:w="1701"/>
-        <w:gridCol w:w="7370"/>
-      </w:tblGrid>
       <w:tr>
         <w:tc>
           <w:tcPr>
-            <w:tcW w:type="dxa" w:w="1701"/>
+            <w:tcW w:type="dxa" w:w="1838"/>
           </w:tcPr>
           <w:p>
             <w:pPr>
-              <w:spacing w:after="40"/>
+              <w:spacing w:after="0" w:line="276" w:lineRule="auto"/>
+              <w:jc w:val="left"/>
+            </w:pPr>
+            <w:r/>
+          </w:p>
+        </w:tc>
+        <w:tc>
+          <w:tcPr>
+            <w:tcW w:type="dxa" w:w="7178"/>
+          </w:tcPr>
+          <w:p>
+            <w:pPr>
+              <w:spacing w:after="0" w:line="276" w:lineRule="auto"/>
+              <w:jc w:val="left"/>
+            </w:pPr>
+            <w:r/>
+          </w:p>
+        </w:tc>
+      </w:tr>
+      <w:tr>
+        <w:tc>
+          <w:tcPr>
+            <w:tcW w:type="dxa" w:w="1838"/>
+          </w:tcPr>
+          <w:p>
+            <w:pPr>
+              <w:spacing w:after="0" w:line="276" w:lineRule="auto"/>
+              <w:jc w:val="left"/>
             </w:pPr>
             <w:r>
               <w:rPr>
-                <w:i w:val="0"/>
+                <w:u w:val="single"/>
               </w:rPr>
+              <w:t>Symbols</w:t>
+            </w:r>
+          </w:p>
+        </w:tc>
+        <w:tc>
+          <w:tcPr>
+            <w:tcW w:type="dxa" w:w="7178"/>
+          </w:tcPr>
+          <w:p>
+            <w:pPr>
+              <w:spacing w:after="0" w:line="276" w:lineRule="auto"/>
+              <w:jc w:val="left"/>
+            </w:pPr>
+          </w:p>
+        </w:tc>
+      </w:tr>
+      <w:tr>
+        <w:tc>
+          <w:tcPr>
+            <w:tcW w:type="dxa" w:w="1838"/>
+          </w:tcPr>
+          <w:p>
+            <w:pPr>
+              <w:spacing w:after="0" w:line="276" w:lineRule="auto"/>
+              <w:jc w:val="left"/>
+            </w:pPr>
+            <w:r>
               <w:t>kV</w:t>
             </w:r>
           </w:p>
         </w:tc>
         <w:tc>
           <w:tcPr>
-            <w:tcW w:type="dxa" w:w="7370"/>
+            <w:tcW w:type="dxa" w:w="7178"/>
           </w:tcPr>
           <w:p>
             <w:pPr>
-              <w:spacing w:after="40"/>
+              <w:spacing w:after="0" w:line="276" w:lineRule="auto"/>
+              <w:jc w:val="left"/>
             </w:pPr>
             <w:r>
               <w:t>kilovolt</w:t>
@@ -783,27 +810,26 @@
       <w:tr>
         <w:tc>
           <w:tcPr>
-            <w:tcW w:type="dxa" w:w="1701"/>
+            <w:tcW w:type="dxa" w:w="1838"/>
           </w:tcPr>
           <w:p>
             <w:pPr>
-              <w:spacing w:after="40"/>
+              <w:spacing w:after="0" w:line="276" w:lineRule="auto"/>
+              <w:jc w:val="left"/>
             </w:pPr>
             <w:r>
-              <w:rPr>
-                <w:i w:val="0"/>
-              </w:rPr>
               <w:t>A</w:t>
             </w:r>
           </w:p>
         </w:tc>
         <w:tc>
           <w:tcPr>
-            <w:tcW w:type="dxa" w:w="7370"/>
+            <w:tcW w:type="dxa" w:w="7178"/>
           </w:tcPr>
           <w:p>
             <w:pPr>
-              <w:spacing w:after="40"/>
+              <w:spacing w:after="0" w:line="276" w:lineRule="auto"/>
+              <w:jc w:val="left"/>
             </w:pPr>
             <w:r>
               <w:t>ampere</w:t>
@@ -814,27 +840,26 @@
       <w:tr>
         <w:tc>
           <w:tcPr>
-            <w:tcW w:type="dxa" w:w="1701"/>
+            <w:tcW w:type="dxa" w:w="1838"/>
           </w:tcPr>
           <w:p>
             <w:pPr>
-              <w:spacing w:after="40"/>
+              <w:spacing w:after="0" w:line="276" w:lineRule="auto"/>
+              <w:jc w:val="left"/>
             </w:pPr>
             <w:r>
-              <w:rPr>
-                <w:i w:val="0"/>
-              </w:rPr>
               <w:t>US$</w:t>
             </w:r>
           </w:p>
         </w:tc>
         <w:tc>
           <w:tcPr>
-            <w:tcW w:type="dxa" w:w="7370"/>
+            <w:tcW w:type="dxa" w:w="7178"/>
           </w:tcPr>
           <w:p>
             <w:pPr>
-              <w:spacing w:after="40"/>
+              <w:spacing w:after="0" w:line="276" w:lineRule="auto"/>
+              <w:jc w:val="left"/>
             </w:pPr>
             <w:r>
               <w:t>United States dollar</w:t>
@@ -845,11 +870,12 @@
       <w:tr>
         <w:tc>
           <w:tcPr>
-            <w:tcW w:type="dxa" w:w="1701"/>
+            <w:tcW w:type="dxa" w:w="1838"/>
           </w:tcPr>
           <w:p>
             <w:pPr>
-              <w:spacing w:after="40"/>
+              <w:spacing w:after="0" w:line="276" w:lineRule="auto"/>
+              <w:jc w:val="left"/>
             </w:pPr>
             <w:r>
               <w:rPr>
@@ -857,21 +883,16 @@
               </w:rPr>
               <w:t>S</w:t>
             </w:r>
-            <w:r>
-              <w:rPr>
-                <w:i/>
-                <w:vertAlign w:val="subscript"/>
-              </w:rPr>
-            </w:r>
           </w:p>
         </w:tc>
         <w:tc>
           <w:tcPr>
-            <w:tcW w:type="dxa" w:w="7370"/>
+            <w:tcW w:type="dxa" w:w="7178"/>
           </w:tcPr>
           <w:p>
             <w:pPr>
-              <w:spacing w:after="40"/>
+              <w:spacing w:after="0" w:line="276" w:lineRule="auto"/>
+              <w:jc w:val="left"/>
             </w:pPr>
             <w:r>
               <w:t>Percentage time saving per lookup</w:t>
@@ -882,11 +903,12 @@
       <w:tr>
         <w:tc>
           <w:tcPr>
-            <w:tcW w:type="dxa" w:w="1701"/>
+            <w:tcW w:type="dxa" w:w="1838"/>
           </w:tcPr>
           <w:p>
             <w:pPr>
-              <w:spacing w:after="40"/>
+              <w:spacing w:after="0" w:line="276" w:lineRule="auto"/>
+              <w:jc w:val="left"/>
             </w:pPr>
             <w:r>
               <w:rPr>
@@ -905,11 +927,12 @@
         </w:tc>
         <w:tc>
           <w:tcPr>
-            <w:tcW w:type="dxa" w:w="7370"/>
+            <w:tcW w:type="dxa" w:w="7178"/>
           </w:tcPr>
           <w:p>
             <w:pPr>
-              <w:spacing w:after="40"/>
+              <w:spacing w:after="0" w:line="276" w:lineRule="auto"/>
+              <w:jc w:val="left"/>
             </w:pPr>
             <w:r>
               <w:t>Time per lookup using the current method (min)</w:t>
@@ -920,11 +943,12 @@
       <w:tr>
         <w:tc>
           <w:tcPr>
-            <w:tcW w:type="dxa" w:w="1701"/>
+            <w:tcW w:type="dxa" w:w="1838"/>
           </w:tcPr>
           <w:p>
             <w:pPr>
-              <w:spacing w:after="40"/>
+              <w:spacing w:after="0" w:line="276" w:lineRule="auto"/>
+              <w:jc w:val="left"/>
             </w:pPr>
             <w:r>
               <w:rPr>
@@ -943,11 +967,12 @@
         </w:tc>
         <w:tc>
           <w:tcPr>
-            <w:tcW w:type="dxa" w:w="7370"/>
+            <w:tcW w:type="dxa" w:w="7178"/>
           </w:tcPr>
           <w:p>
             <w:pPr>
-              <w:spacing w:after="40"/>
+              <w:spacing w:after="0" w:line="276" w:lineRule="auto"/>
+              <w:jc w:val="left"/>
             </w:pPr>
             <w:r>
               <w:t>Time per lookup using the application (min)</w:t>
@@ -1329,9 +1354,6 @@
     <w:name w:val="Normal"/>
     <w:qFormat/>
     <w:rsid w:val="00FC693F"/>
-    <w:pPr>
-      <w:spacing w:after="120"/>
-    </w:pPr>
     <w:rPr>
       <w:rFonts w:ascii="Times New Roman" w:hAnsi="Times New Roman" w:eastAsia="Times New Roman"/>
       <w:sz w:val="22"/>

</xml_diff>

<commit_message>
Add the equation symbols to the nomenclature
Co-Authored-By: Claude Opus 5.5 <noreply@anthropic.com>
Claude-Session: https://claude.ai/code/session_01S6mvbXzTvRoGpVPUkaDb65
</commit_message>
<xml_diff>
--- a/report/Nomenclature.docx
+++ b/report/Nomenclature.docx
@@ -72,6 +72,9 @@
               <w:jc w:val="left"/>
             </w:pPr>
             <w:r>
+              <w:rPr>
+                <w:i w:val="0"/>
+              </w:rPr>
               <w:t>CAD</w:t>
             </w:r>
           </w:p>
@@ -102,6 +105,9 @@
               <w:jc w:val="left"/>
             </w:pPr>
             <w:r>
+              <w:rPr>
+                <w:i w:val="0"/>
+              </w:rPr>
               <w:t>CMMS</w:t>
             </w:r>
           </w:p>
@@ -132,6 +138,9 @@
               <w:jc w:val="left"/>
             </w:pPr>
             <w:r>
+              <w:rPr>
+                <w:i w:val="0"/>
+              </w:rPr>
               <w:t>DN</w:t>
             </w:r>
           </w:p>
@@ -162,6 +171,9 @@
               <w:jc w:val="left"/>
             </w:pPr>
             <w:r>
+              <w:rPr>
+                <w:i w:val="0"/>
+              </w:rPr>
               <w:t>EMA</w:t>
             </w:r>
           </w:p>
@@ -192,6 +204,9 @@
               <w:jc w:val="left"/>
             </w:pPr>
             <w:r>
+              <w:rPr>
+                <w:i w:val="0"/>
+              </w:rPr>
               <w:t>HV</w:t>
             </w:r>
           </w:p>
@@ -222,6 +237,9 @@
               <w:jc w:val="left"/>
             </w:pPr>
             <w:r>
+              <w:rPr>
+                <w:i w:val="0"/>
+              </w:rPr>
               <w:t>HVAC</w:t>
             </w:r>
           </w:p>
@@ -252,6 +270,9 @@
               <w:jc w:val="left"/>
             </w:pPr>
             <w:r>
+              <w:rPr>
+                <w:i w:val="0"/>
+              </w:rPr>
               <w:t>LEW</w:t>
             </w:r>
           </w:p>
@@ -282,6 +303,9 @@
               <w:jc w:val="left"/>
             </w:pPr>
             <w:r>
+              <w:rPr>
+                <w:i w:val="0"/>
+              </w:rPr>
               <w:t>LV</w:t>
             </w:r>
           </w:p>
@@ -312,6 +336,9 @@
               <w:jc w:val="left"/>
             </w:pPr>
             <w:r>
+              <w:rPr>
+                <w:i w:val="0"/>
+              </w:rPr>
               <w:t>LVDN</w:t>
             </w:r>
           </w:p>
@@ -342,6 +369,9 @@
               <w:jc w:val="left"/>
             </w:pPr>
             <w:r>
+              <w:rPr>
+                <w:i w:val="0"/>
+              </w:rPr>
               <w:t>LVSB</w:t>
             </w:r>
           </w:p>
@@ -372,6 +402,9 @@
               <w:jc w:val="left"/>
             </w:pPr>
             <w:r>
+              <w:rPr>
+                <w:i w:val="0"/>
+              </w:rPr>
               <w:t>MCB</w:t>
             </w:r>
           </w:p>
@@ -402,6 +435,9 @@
               <w:jc w:val="left"/>
             </w:pPr>
             <w:r>
+              <w:rPr>
+                <w:i w:val="0"/>
+              </w:rPr>
               <w:t>MCCB</w:t>
             </w:r>
           </w:p>
@@ -432,6 +468,9 @@
               <w:jc w:val="left"/>
             </w:pPr>
             <w:r>
+              <w:rPr>
+                <w:i w:val="0"/>
+              </w:rPr>
               <w:t>PDF</w:t>
             </w:r>
           </w:p>
@@ -462,6 +501,9 @@
               <w:jc w:val="left"/>
             </w:pPr>
             <w:r>
+              <w:rPr>
+                <w:i w:val="0"/>
+              </w:rPr>
               <w:t>RFID</w:t>
             </w:r>
           </w:p>
@@ -492,6 +534,9 @@
               <w:jc w:val="left"/>
             </w:pPr>
             <w:r>
+              <w:rPr>
+                <w:i w:val="0"/>
+              </w:rPr>
               <w:t>SCADA</w:t>
             </w:r>
           </w:p>
@@ -522,6 +567,9 @@
               <w:jc w:val="left"/>
             </w:pPr>
             <w:r>
+              <w:rPr>
+                <w:i w:val="0"/>
+              </w:rPr>
               <w:t>SDG</w:t>
             </w:r>
           </w:p>
@@ -552,6 +600,9 @@
               <w:jc w:val="left"/>
             </w:pPr>
             <w:r>
+              <w:rPr>
+                <w:i w:val="0"/>
+              </w:rPr>
               <w:t>SLD</w:t>
             </w:r>
           </w:p>
@@ -582,6 +633,9 @@
               <w:jc w:val="left"/>
             </w:pPr>
             <w:r>
+              <w:rPr>
+                <w:i w:val="0"/>
+              </w:rPr>
               <w:t>SQL</w:t>
             </w:r>
           </w:p>
@@ -612,6 +666,9 @@
               <w:jc w:val="left"/>
             </w:pPr>
             <w:r>
+              <w:rPr>
+                <w:i w:val="0"/>
+              </w:rPr>
               <w:t>SS</w:t>
             </w:r>
           </w:p>
@@ -642,6 +699,9 @@
               <w:jc w:val="left"/>
             </w:pPr>
             <w:r>
+              <w:rPr>
+                <w:i w:val="0"/>
+              </w:rPr>
               <w:t>SSMC</w:t>
             </w:r>
           </w:p>
@@ -672,6 +732,9 @@
               <w:jc w:val="left"/>
             </w:pPr>
             <w:r>
+              <w:rPr>
+                <w:i w:val="0"/>
+              </w:rPr>
               <w:t>URL</w:t>
             </w:r>
           </w:p>
@@ -702,6 +765,9 @@
               <w:jc w:val="left"/>
             </w:pPr>
             <w:r>
+              <w:rPr>
+                <w:i w:val="0"/>
+              </w:rPr>
               <w:t>µPMU</w:t>
             </w:r>
           </w:p>
@@ -731,7 +797,11 @@
               <w:spacing w:after="0" w:line="276" w:lineRule="auto"/>
               <w:jc w:val="left"/>
             </w:pPr>
-            <w:r/>
+            <w:r>
+              <w:rPr>
+                <w:i w:val="0"/>
+              </w:rPr>
+            </w:r>
           </w:p>
         </w:tc>
         <w:tc>
@@ -788,7 +858,10 @@
               <w:jc w:val="left"/>
             </w:pPr>
             <w:r>
-              <w:t>kV</w:t>
+              <w:rPr>
+                <w:i/>
+              </w:rPr>
+              <w:t>C</w:t>
             </w:r>
           </w:p>
         </w:tc>
@@ -802,7 +875,7 @@
               <w:jc w:val="left"/>
             </w:pPr>
             <w:r>
-              <w:t>kilovolt</w:t>
+              <w:t>Capacity of a circuit breaker (A)</w:t>
             </w:r>
           </w:p>
         </w:tc>
@@ -818,7 +891,10 @@
               <w:jc w:val="left"/>
             </w:pPr>
             <w:r>
-              <w:t>A</w:t>
+              <w:rPr>
+                <w:i/>
+              </w:rPr>
+              <w:t>I</w:t>
             </w:r>
           </w:p>
         </w:tc>
@@ -832,7 +908,7 @@
               <w:jc w:val="left"/>
             </w:pPr>
             <w:r>
-              <w:t>ampere</w:t>
+              <w:t>Load current (A)</w:t>
             </w:r>
           </w:p>
         </w:tc>
@@ -848,7 +924,17 @@
               <w:jc w:val="left"/>
             </w:pPr>
             <w:r>
-              <w:t>US$</w:t>
+              <w:rPr>
+                <w:i/>
+              </w:rPr>
+              <w:t>I</w:t>
+            </w:r>
+            <w:r>
+              <w:rPr>
+                <w:i/>
+                <w:vertAlign w:val="subscript"/>
+              </w:rPr>
+              <w:t>n</w:t>
             </w:r>
           </w:p>
         </w:tc>
@@ -862,7 +948,40 @@
               <w:jc w:val="left"/>
             </w:pPr>
             <w:r>
-              <w:t>United States dollar</w:t>
+              <w:t>Rated current of a circuit breaker (A)</w:t>
+            </w:r>
+          </w:p>
+        </w:tc>
+      </w:tr>
+      <w:tr>
+        <w:tc>
+          <w:tcPr>
+            <w:tcW w:type="dxa" w:w="1838"/>
+          </w:tcPr>
+          <w:p>
+            <w:pPr>
+              <w:spacing w:after="0" w:line="276" w:lineRule="auto"/>
+              <w:jc w:val="left"/>
+            </w:pPr>
+            <w:r>
+              <w:rPr>
+                <w:i/>
+              </w:rPr>
+              <w:t>k</w:t>
+            </w:r>
+          </w:p>
+        </w:tc>
+        <w:tc>
+          <w:tcPr>
+            <w:tcW w:type="dxa" w:w="7178"/>
+          </w:tcPr>
+          <w:p>
+            <w:pPr>
+              <w:spacing w:after="0" w:line="276" w:lineRule="auto"/>
+              <w:jc w:val="left"/>
+            </w:pPr>
+            <w:r>
+              <w:t>Capacity factor applied to the rated current (default 1.14)</w:t>
             </w:r>
           </w:p>
         </w:tc>
@@ -895,7 +1014,47 @@
               <w:jc w:val="left"/>
             </w:pPr>
             <w:r>
-              <w:t>Percentage time saving per lookup</w:t>
+              <w:t>Time saving per lookup (%)</w:t>
+            </w:r>
+          </w:p>
+        </w:tc>
+      </w:tr>
+      <w:tr>
+        <w:tc>
+          <w:tcPr>
+            <w:tcW w:type="dxa" w:w="1838"/>
+          </w:tcPr>
+          <w:p>
+            <w:pPr>
+              <w:spacing w:after="0" w:line="276" w:lineRule="auto"/>
+              <w:jc w:val="left"/>
+            </w:pPr>
+            <w:r>
+              <w:rPr>
+                <w:i/>
+              </w:rPr>
+              <w:t>T</w:t>
+            </w:r>
+            <w:r>
+              <w:rPr>
+                <w:i/>
+                <w:vertAlign w:val="subscript"/>
+              </w:rPr>
+              <w:t>app</w:t>
+            </w:r>
+          </w:p>
+        </w:tc>
+        <w:tc>
+          <w:tcPr>
+            <w:tcW w:type="dxa" w:w="7178"/>
+          </w:tcPr>
+          <w:p>
+            <w:pPr>
+              <w:spacing w:after="0" w:line="276" w:lineRule="auto"/>
+              <w:jc w:val="left"/>
+            </w:pPr>
+            <w:r>
+              <w:t>Time per lookup using the application (min)</w:t>
             </w:r>
           </w:p>
         </w:tc>
@@ -954,14 +1113,7 @@
               <w:rPr>
                 <w:i/>
               </w:rPr>
-              <w:t>T</w:t>
-            </w:r>
-            <w:r>
-              <w:rPr>
-                <w:i/>
-                <w:vertAlign w:val="subscript"/>
-              </w:rPr>
-              <w:t>app</w:t>
+              <w:t>U</w:t>
             </w:r>
           </w:p>
         </w:tc>
@@ -975,7 +1127,199 @@
               <w:jc w:val="left"/>
             </w:pPr>
             <w:r>
-              <w:t>Time per lookup using the application (min)</w:t>
+              <w:t>Utilisation of a circuit breaker (%)</w:t>
+            </w:r>
+          </w:p>
+        </w:tc>
+      </w:tr>
+      <w:tr>
+        <w:tc>
+          <w:tcPr>
+            <w:tcW w:type="dxa" w:w="1838"/>
+          </w:tcPr>
+          <w:p>
+            <w:pPr>
+              <w:spacing w:after="0" w:line="276" w:lineRule="auto"/>
+              <w:jc w:val="left"/>
+            </w:pPr>
+            <w:r>
+              <w:rPr>
+                <w:i w:val="0"/>
+              </w:rPr>
+            </w:r>
+          </w:p>
+        </w:tc>
+        <w:tc>
+          <w:tcPr>
+            <w:tcW w:type="dxa" w:w="7178"/>
+          </w:tcPr>
+          <w:p>
+            <w:pPr>
+              <w:spacing w:after="0" w:line="276" w:lineRule="auto"/>
+              <w:jc w:val="left"/>
+            </w:pPr>
+            <w:r/>
+          </w:p>
+        </w:tc>
+      </w:tr>
+      <w:tr>
+        <w:tc>
+          <w:tcPr>
+            <w:tcW w:type="dxa" w:w="1838"/>
+          </w:tcPr>
+          <w:p>
+            <w:pPr>
+              <w:spacing w:after="0" w:line="276" w:lineRule="auto"/>
+              <w:jc w:val="left"/>
+            </w:pPr>
+            <w:r>
+              <w:rPr>
+                <w:u w:val="single"/>
+              </w:rPr>
+              <w:t>Units</w:t>
+            </w:r>
+          </w:p>
+        </w:tc>
+        <w:tc>
+          <w:tcPr>
+            <w:tcW w:type="dxa" w:w="7178"/>
+          </w:tcPr>
+          <w:p>
+            <w:pPr>
+              <w:spacing w:after="0" w:line="276" w:lineRule="auto"/>
+              <w:jc w:val="left"/>
+            </w:pPr>
+          </w:p>
+        </w:tc>
+      </w:tr>
+      <w:tr>
+        <w:tc>
+          <w:tcPr>
+            <w:tcW w:type="dxa" w:w="1838"/>
+          </w:tcPr>
+          <w:p>
+            <w:pPr>
+              <w:spacing w:after="0" w:line="276" w:lineRule="auto"/>
+              <w:jc w:val="left"/>
+            </w:pPr>
+            <w:r>
+              <w:rPr>
+                <w:i w:val="0"/>
+              </w:rPr>
+              <w:t>A</w:t>
+            </w:r>
+          </w:p>
+        </w:tc>
+        <w:tc>
+          <w:tcPr>
+            <w:tcW w:type="dxa" w:w="7178"/>
+          </w:tcPr>
+          <w:p>
+            <w:pPr>
+              <w:spacing w:after="0" w:line="276" w:lineRule="auto"/>
+              <w:jc w:val="left"/>
+            </w:pPr>
+            <w:r>
+              <w:t>ampere</w:t>
+            </w:r>
+          </w:p>
+        </w:tc>
+      </w:tr>
+      <w:tr>
+        <w:tc>
+          <w:tcPr>
+            <w:tcW w:type="dxa" w:w="1838"/>
+          </w:tcPr>
+          <w:p>
+            <w:pPr>
+              <w:spacing w:after="0" w:line="276" w:lineRule="auto"/>
+              <w:jc w:val="left"/>
+            </w:pPr>
+            <w:r>
+              <w:rPr>
+                <w:i w:val="0"/>
+              </w:rPr>
+              <w:t>kV</w:t>
+            </w:r>
+          </w:p>
+        </w:tc>
+        <w:tc>
+          <w:tcPr>
+            <w:tcW w:type="dxa" w:w="7178"/>
+          </w:tcPr>
+          <w:p>
+            <w:pPr>
+              <w:spacing w:after="0" w:line="276" w:lineRule="auto"/>
+              <w:jc w:val="left"/>
+            </w:pPr>
+            <w:r>
+              <w:t>kilovolt</w:t>
+            </w:r>
+          </w:p>
+        </w:tc>
+      </w:tr>
+      <w:tr>
+        <w:tc>
+          <w:tcPr>
+            <w:tcW w:type="dxa" w:w="1838"/>
+          </w:tcPr>
+          <w:p>
+            <w:pPr>
+              <w:spacing w:after="0" w:line="276" w:lineRule="auto"/>
+              <w:jc w:val="left"/>
+            </w:pPr>
+            <w:r>
+              <w:rPr>
+                <w:i w:val="0"/>
+              </w:rPr>
+              <w:t>min</w:t>
+            </w:r>
+          </w:p>
+        </w:tc>
+        <w:tc>
+          <w:tcPr>
+            <w:tcW w:type="dxa" w:w="7178"/>
+          </w:tcPr>
+          <w:p>
+            <w:pPr>
+              <w:spacing w:after="0" w:line="276" w:lineRule="auto"/>
+              <w:jc w:val="left"/>
+            </w:pPr>
+            <w:r>
+              <w:t>minute</w:t>
+            </w:r>
+          </w:p>
+        </w:tc>
+      </w:tr>
+      <w:tr>
+        <w:tc>
+          <w:tcPr>
+            <w:tcW w:type="dxa" w:w="1838"/>
+          </w:tcPr>
+          <w:p>
+            <w:pPr>
+              <w:spacing w:after="0" w:line="276" w:lineRule="auto"/>
+              <w:jc w:val="left"/>
+            </w:pPr>
+            <w:r>
+              <w:rPr>
+                <w:i w:val="0"/>
+              </w:rPr>
+              <w:t>US$</w:t>
+            </w:r>
+          </w:p>
+        </w:tc>
+        <w:tc>
+          <w:tcPr>
+            <w:tcW w:type="dxa" w:w="7178"/>
+          </w:tcPr>
+          <w:p>
+            <w:pPr>
+              <w:spacing w:after="0" w:line="276" w:lineRule="auto"/>
+              <w:jc w:val="left"/>
+            </w:pPr>
+            <w:r>
+              <w:t>United States dollar</w:t>
             </w:r>
           </w:p>
         </w:tc>

</xml_diff>